<commit_message>
Clarify reference-run data and retraining limits
Co-authored-by: Copilot <223556219+Copilot@users.noreply.github.com>
</commit_message>
<xml_diff>
--- a/paper/paper.docx
+++ b/paper/paper.docx
@@ -258,19 +258,19 @@
         <w:t xml:space="preserve"> </w:t>
       </w:r>
       <w:r>
-        <w:t xml:space="preserve">consistent inputs for downstream analysis. The pretrained model targets the</w:t>
-      </w:r>
-      <w:r>
-        <w:t xml:space="preserve"> </w:t>
-      </w:r>
-      <w:r>
-        <w:t xml:space="preserve">fan-shaped scan sector produced by phased-array cardiac probes and may</w:t>
-      </w:r>
-      <w:r>
-        <w:t xml:space="preserve"> </w:t>
-      </w:r>
-      <w:r>
-        <w:t xml:space="preserve">generalise to similar curvilinear sector geometries, but is unlikely to</w:t>
+        <w:t xml:space="preserve">consistent inputs for downstream analysis. The authors’ reference model</w:t>
+      </w:r>
+      <w:r>
+        <w:t xml:space="preserve"> </w:t>
+      </w:r>
+      <w:r>
+        <w:t xml:space="preserve">targets the fan-shaped scan sector produced by phased-array cardiac probes and</w:t>
+      </w:r>
+      <w:r>
+        <w:t xml:space="preserve"> </w:t>
+      </w:r>
+      <w:r>
+        <w:t xml:space="preserve">may generalise to similar curvilinear sector geometries, but is unlikely to</w:t>
       </w:r>
       <w:r>
         <w:t xml:space="preserve"> </w:t>
@@ -363,7 +363,31 @@
         <w:pStyle w:val="BodyText"/>
       </w:pPr>
       <w:r>
-        <w:t xml:space="preserve">Pretrained weights are not distributed with this release because the contributing datasets have differing access and reuse conditions. Researchers must obtain source datasets independently from their providers. Requests for scan-sector annotations should be directed to the EchoROI authors; availability is assessed for each dataset under the applicable agreements and institutional permissions.</w:t>
+        <w:t xml:space="preserve">This release includes neither pretrained weights nor source datasets.</w:t>
+      </w:r>
+      <w:r>
+        <w:t xml:space="preserve"> </w:t>
+      </w:r>
+      <w:r>
+        <w:t xml:space="preserve">Researchers must obtain source datasets independently from their providers.</w:t>
+      </w:r>
+      <w:r>
+        <w:t xml:space="preserve"> </w:t>
+      </w:r>
+      <w:r>
+        <w:t xml:space="preserve">Requests for scan-sector annotations should be directed to the EchoROI</w:t>
+      </w:r>
+      <w:r>
+        <w:t xml:space="preserve"> </w:t>
+      </w:r>
+      <w:r>
+        <w:t xml:space="preserve">authors; availability is assessed for each dataset under the applicable</w:t>
+      </w:r>
+      <w:r>
+        <w:t xml:space="preserve"> </w:t>
+      </w:r>
+      <w:r>
+        <w:t xml:space="preserve">agreements and institutional permissions.</w:t>
       </w:r>
     </w:p>
     <w:p>
@@ -719,7 +743,7 @@
         <w:t xml:space="preserve"> </w:t>
       </w:r>
       <w:r>
-        <w:t xml:space="preserve">than relying on fixed crop templates, the provided pretrained model has learnt</w:t>
+        <w:t xml:space="preserve">than relying on fixed crop templates, the authors’ reference model learned</w:t>
       </w:r>
       <w:r>
         <w:t xml:space="preserve"> </w:t>
@@ -737,7 +761,7 @@
         <w:t xml:space="preserve"> </w:t>
       </w:r>
       <w:r>
-        <w:t xml:space="preserve">sector. This is useful for privacy-preserving preprocessing, multi-source</w:t>
+        <w:t xml:space="preserve">sector. This supports privacy-aware preprocessing, multi-source</w:t>
       </w:r>
       <w:r>
         <w:t xml:space="preserve"> </w:t>
@@ -1223,13 +1247,43 @@
         <w:pStyle w:val="FirstParagraph"/>
       </w:pPr>
       <w:r>
-        <w:t xml:space="preserve">For most echocardiography clips, sector geometry remains fixed throughout the</w:t>
-      </w:r>
-      <w:r>
-        <w:t xml:space="preserve"> </w:t>
-      </w:r>
-      <w:r>
-        <w:t xml:space="preserve">cine loop.</w:t>
+        <w:t xml:space="preserve">For echocardiography clips with fixed sector geometry, the DICOM preprocessing</w:t>
+      </w:r>
+      <w:r>
+        <w:t xml:space="preserve"> </w:t>
+      </w:r>
+      <w:r>
+        <w:t xml:space="preserve">notebook selects a representative frame using grayscale Shannon entropy</w:t>
+      </w:r>
+      <w:r>
+        <w:t xml:space="preserve"> </w:t>
+      </w:r>
+      <w:r>
+        <w:t xml:space="preserve">(Shannon 1948)</w:t>
+      </w:r>
+      <w:r>
+        <w:t xml:space="preserve"> </w:t>
+      </w:r>
+      <w:r>
+        <w:t xml:space="preserve">and applies the predicted sector mask across the sequence.</w:t>
+      </w:r>
+      <w:r>
+        <w:t xml:space="preserve"> </w:t>
+      </w:r>
+      <w:r>
+        <w:t xml:space="preserve">This notebook workflow reduces repeated inference and helps avoid blank or</w:t>
+      </w:r>
+      <w:r>
+        <w:t xml:space="preserve"> </w:t>
+      </w:r>
+      <w:r>
+        <w:t xml:space="preserve">transition frames. The image-prediction CLI shown above operates on supplied</w:t>
+      </w:r>
+      <w:r>
+        <w:t xml:space="preserve"> </w:t>
+      </w:r>
+      <w:r>
+        <w:t xml:space="preserve">image files; representative-frame selection is not a CLI default. Without</w:t>
       </w:r>
       <w:r>
         <w:t xml:space="preserve"> </w:t>
@@ -1238,64 +1292,16 @@
         <w:rPr>
           <w:rStyle w:val="VerbatimChar"/>
         </w:rPr>
-        <w:t xml:space="preserve">EchoROI</w:t>
-      </w:r>
-      <w:r>
-        <w:t xml:space="preserve"> </w:t>
-      </w:r>
-      <w:r>
-        <w:t xml:space="preserve">therefore predicts the mask from a single representative</w:t>
-      </w:r>
-      <w:r>
-        <w:t xml:space="preserve"> </w:t>
-      </w:r>
-      <w:r>
-        <w:t xml:space="preserve">frame and applies the same mask and crop logic across the full sequence. By</w:t>
-      </w:r>
-      <w:r>
-        <w:t xml:space="preserve"> </w:t>
-      </w:r>
-      <w:r>
-        <w:t xml:space="preserve">default, the representative frame is chosen from the first few frames using</w:t>
-      </w:r>
-      <w:r>
-        <w:t xml:space="preserve"> </w:t>
-      </w:r>
-      <w:r>
-        <w:t xml:space="preserve">grayscale Shannon entropy</w:t>
-      </w:r>
-      <w:r>
-        <w:t xml:space="preserve"> </w:t>
-      </w:r>
-      <w:r>
-        <w:t xml:space="preserve">(Shannon 1948)</w:t>
-      </w:r>
-      <w:r>
-        <w:t xml:space="preserve">, reducing compute cost and helping</w:t>
-      </w:r>
-      <w:r>
-        <w:t xml:space="preserve"> </w:t>
-      </w:r>
-      <w:r>
-        <w:t xml:space="preserve">avoid blank or transition frames. Without</w:t>
-      </w:r>
-      <w:r>
-        <w:t xml:space="preserve"> </w:t>
-      </w:r>
-      <w:r>
-        <w:rPr>
-          <w:rStyle w:val="VerbatimChar"/>
-        </w:rPr>
         <w:t xml:space="preserve">--deidentify</w:t>
       </w:r>
       <w:r>
-        <w:t xml:space="preserve">, only the predicted</w:t>
-      </w:r>
-      <w:r>
-        <w:t xml:space="preserve"> </w:t>
-      </w:r>
-      <w:r>
-        <w:t xml:space="preserve">binary mask is saved, allowing users to apply it in custom downstream</w:t>
+        <w:t xml:space="preserve">, only the predicted binary mask is saved, allowing users to</w:t>
+      </w:r>
+      <w:r>
+        <w:t xml:space="preserve"> </w:t>
+      </w:r>
+      <w:r>
+        <w:t xml:space="preserve">apply it in custom downstream</w:t>
       </w:r>
       <w:r>
         <w:t xml:space="preserve"> </w:t>
@@ -1678,7 +1684,13 @@
         <w:t xml:space="preserve"> </w:t>
       </w:r>
       <w:r>
-        <w:t xml:space="preserve">particular source from these records. A historical summary edit at commit</w:t>
+        <w:t xml:space="preserve">particular source from these records. The detailed reconciliation of collection</w:t>
+      </w:r>
+      <w:r>
+        <w:t xml:space="preserve"> </w:t>
+      </w:r>
+      <w:r>
+        <w:t xml:space="preserve">counts and saved run records is provided in</w:t>
       </w:r>
       <w:r>
         <w:t xml:space="preserve"> </w:t>
@@ -1687,50 +1699,20 @@
         <w:rPr>
           <w:rStyle w:val="VerbatimChar"/>
         </w:rPr>
-        <w:t xml:space="preserve">1a36462</w:t>
-      </w:r>
-      <w:r>
-        <w:t xml:space="preserve"> </w:t>
-      </w:r>
-      <w:r>
-        <w:t xml:space="preserve">changed counts from 1,206 to 1,355 without changing other summary</w:t>
-      </w:r>
-      <w:r>
-        <w:t xml:space="preserve"> </w:t>
-      </w:r>
-      <w:r>
-        <w:t xml:space="preserve">fields; the later reference-run update at</w:t>
-      </w:r>
-      <w:r>
-        <w:t xml:space="preserve"> </w:t>
-      </w:r>
-      <w:r>
-        <w:rPr>
-          <w:rStyle w:val="VerbatimChar"/>
-        </w:rPr>
-        <w:t xml:space="preserve">67d6ecc</w:t>
-      </w:r>
-      <w:r>
-        <w:t xml:space="preserve"> </w:t>
-      </w:r>
-      <w:r>
-        <w:t xml:space="preserve">records 1,206 pairs</w:t>
-      </w:r>
-      <w:r>
-        <w:t xml:space="preserve"> </w:t>
-      </w:r>
-      <w:r>
-        <w:t xml:space="preserve">alongside new logs and metrics. The intermediate summary is not independent</w:t>
-      </w:r>
-      <w:r>
-        <w:t xml:space="preserve"> </w:t>
-      </w:r>
-      <w:r>
-        <w:t xml:space="preserve">evidence of training on the entire inventory.</w:t>
+        <w:t xml:space="preserve">training_results/README.md</w:t>
+      </w:r>
+      <w:r>
+        <w:t xml:space="preserve">.</w:t>
+      </w:r>
+      <w:r>
+        <w:t xml:space="preserve"> </w:t>
+      </w:r>
+      <w:r>
+        <w:t xml:space="preserve">A collection count alone does not establish the membership of a training run.</w:t>
       </w:r>
     </w:p>
     <w:bookmarkEnd w:id="28"/>
-    <w:bookmarkStart w:id="30" w:name="validation-and-reuse"/>
+    <w:bookmarkStart w:id="32" w:name="validation-and-reuse"/>
     <w:p>
       <w:pPr>
         <w:pStyle w:val="Heading1"/>
@@ -1742,6 +1724,64 @@
     <w:p>
       <w:pPr>
         <w:pStyle w:val="FirstParagraph"/>
+      </w:pPr>
+      <w:r>
+        <w:t xml:space="preserve">The documented workflow is to obtain source datasets independently from their</w:t>
+      </w:r>
+      <w:r>
+        <w:t xml:space="preserve"> </w:t>
+      </w:r>
+      <w:r>
+        <w:t xml:space="preserve">providers; request any available sector masks from the authors; use the</w:t>
+      </w:r>
+      <w:r>
+        <w:t xml:space="preserve"> </w:t>
+      </w:r>
+      <w:r>
+        <w:t xml:space="preserve">authorised manifest and decoding recipe to match each mask to its original</w:t>
+      </w:r>
+      <w:r>
+        <w:t xml:space="preserve"> </w:t>
+      </w:r>
+      <w:r>
+        <w:t xml:space="preserve">native decoded frame; train and evaluate locally using the</w:t>
+      </w:r>
+      <w:r>
+        <w:t xml:space="preserve"> </w:t>
+      </w:r>
+      <w:hyperlink r:id="rId29">
+        <w:r>
+          <w:rPr>
+            <w:rStyle w:val="Hyperlink"/>
+          </w:rPr>
+          <w:t xml:space="preserve">retraining instructions</w:t>
+        </w:r>
+      </w:hyperlink>
+      <w:r>
+        <w:t xml:space="preserve">; and optionally export the</w:t>
+      </w:r>
+      <w:r>
+        <w:t xml:space="preserve"> </w:t>
+      </w:r>
+      <w:r>
+        <w:t xml:space="preserve">trained checkpoint to ONNX. Neither the source datasets nor pretrained</w:t>
+      </w:r>
+      <w:r>
+        <w:t xml:space="preserve"> </w:t>
+      </w:r>
+      <w:r>
+        <w:t xml:space="preserve">weights are included. Annotation availability depends on provider and</w:t>
+      </w:r>
+      <w:r>
+        <w:t xml:space="preserve"> </w:t>
+      </w:r>
+      <w:r>
+        <w:t xml:space="preserve">institutional permissions; the private subset may be unavailable.</w:t>
+      </w:r>
+    </w:p>
+    <w:p>
+      <w:pPr>
+        <w:pStyle w:val="BodyText"/>
       </w:pPr>
       <w:r>
         <w:t xml:space="preserve">The authors’ saved reference-model evaluation reports the following results</w:t>
@@ -1940,19 +1980,25 @@
         <w:t xml:space="preserve"> </w:t>
       </w:r>
       <w:r>
-        <w:t xml:space="preserve">benchmark. The software is suitable for routine preprocessing workflows, and</w:t>
-      </w:r>
-      <w:r>
-        <w:t xml:space="preserve"> </w:t>
-      </w:r>
-      <w:r>
-        <w:t xml:space="preserve">implementation-specific benchmarking examples are provided in the repository</w:t>
-      </w:r>
-      <w:r>
-        <w:t xml:space="preserve"> </w:t>
-      </w:r>
-      <w:r>
-        <w:t xml:space="preserve">notebooks.</w:t>
+        <w:t xml:space="preserve">benchmark. These results support the feasibility of sector masking on the</w:t>
+      </w:r>
+      <w:r>
+        <w:t xml:space="preserve"> </w:t>
+      </w:r>
+      <w:r>
+        <w:t xml:space="preserve">recorded validation data. Performance on new sites, scanner layouts, and</w:t>
+      </w:r>
+      <w:r>
+        <w:t xml:space="preserve"> </w:t>
+      </w:r>
+      <w:r>
+        <w:t xml:space="preserve">acquisition conditions requires separate assessment. Implementation-specific</w:t>
+      </w:r>
+      <w:r>
+        <w:t xml:space="preserve"> </w:t>
+      </w:r>
+      <w:r>
+        <w:t xml:space="preserve">benchmarking examples are provided in the repository notebooks.</w:t>
       </w:r>
     </w:p>
     <w:p>
@@ -1984,85 +2030,60 @@
         <w:t xml:space="preserve"> </w:t>
       </w:r>
       <w:r>
-        <w:t xml:space="preserve">The model card also retains previously reported values (Dice 0.9880 and IoU</w:t>
-      </w:r>
-      <w:r>
-        <w:t xml:space="preserve"> </w:t>
-      </w:r>
-      <w:r>
-        <w:t xml:space="preserve">0.9763), matching the older</w:t>
-      </w:r>
-      <w:r>
-        <w:t xml:space="preserve"> </w:t>
-      </w:r>
-      <w:r>
-        <w:rPr>
-          <w:rStyle w:val="VerbatimChar"/>
-        </w:rPr>
-        <w:t xml:space="preserve">metrics.json</w:t>
-      </w:r>
-      <w:r>
-        <w:t xml:space="preserve"> </w:t>
-      </w:r>
-      <w:r>
-        <w:t xml:space="preserve">at</w:t>
-      </w:r>
-      <w:r>
-        <w:t xml:space="preserve"> </w:t>
-      </w:r>
-      <w:r>
-        <w:rPr>
-          <w:rStyle w:val="VerbatimChar"/>
-        </w:rPr>
-        <w:t xml:space="preserve">5e10245</w:t>
-      </w:r>
-      <w:r>
-        <w:t xml:space="preserve">, whose summary records</w:t>
-      </w:r>
-      <w:r>
-        <w:t xml:space="preserve"> </w:t>
-      </w:r>
-      <w:r>
-        <w:t xml:space="preserve">1,206 pairs and batch size 16. That earlier source selected by validation</w:t>
-      </w:r>
-      <w:r>
-        <w:t xml:space="preserve"> </w:t>
-      </w:r>
-      <w:r>
-        <w:t xml:space="preserve">Dice; the later source at</w:t>
-      </w:r>
-      <w:r>
-        <w:t xml:space="preserve"> </w:t>
-      </w:r>
-      <w:r>
-        <w:rPr>
-          <w:rStyle w:val="VerbatimChar"/>
-        </w:rPr>
-        <w:t xml:space="preserve">61e447b</w:t>
-      </w:r>
-      <w:r>
-        <w:t xml:space="preserve"> </w:t>
-      </w:r>
-      <w:r>
-        <w:t xml:space="preserve">introduced IoU selection and source</w:t>
-      </w:r>
-      <w:r>
-        <w:t xml:space="preserve"> </w:t>
-      </w:r>
-      <w:r>
-        <w:t xml:space="preserve">stratification. These experiments and metric summaries should not be treated</w:t>
-      </w:r>
-      <w:r>
-        <w:t xml:space="preserve"> </w:t>
-      </w:r>
-      <w:r>
-        <w:t xml:space="preserve">as interchangeable; neither provides a released per-file split and</w:t>
-      </w:r>
-      <w:r>
-        <w:t xml:space="preserve"> </w:t>
-      </w:r>
-      <w:r>
-        <w:t xml:space="preserve">evaluation-checkpoint hash.</w:t>
+        <w:t xml:space="preserve">The complete original training membership is unresolved and the private</w:t>
+      </w:r>
+      <w:r>
+        <w:t xml:space="preserve"> </w:t>
+      </w:r>
+      <w:r>
+        <w:t xml:space="preserve">subset may be unavailable, so retraining does not guarantee the identical</w:t>
+      </w:r>
+      <w:r>
+        <w:t xml:space="preserve"> </w:t>
+      </w:r>
+      <w:r>
+        <w:t xml:space="preserve">checkpoint or reported metrics. No released per-file split or</w:t>
+      </w:r>
+      <w:r>
+        <w:t xml:space="preserve"> </w:t>
+      </w:r>
+      <w:r>
+        <w:t xml:space="preserve">evaluation-checkpoint hash establishes exact reproduction. These are results</w:t>
+      </w:r>
+      <w:r>
+        <w:t xml:space="preserve"> </w:t>
+      </w:r>
+      <w:r>
+        <w:t xml:space="preserve">of the documented reference experiment, not an external test benchmark; see</w:t>
+      </w:r>
+      <w:r>
+        <w:t xml:space="preserve"> </w:t>
+      </w:r>
+      <w:r>
+        <w:t xml:space="preserve">the</w:t>
+      </w:r>
+      <w:r>
+        <w:t xml:space="preserve"> </w:t>
+      </w:r>
+      <w:hyperlink r:id="rId30">
+        <w:r>
+          <w:rPr>
+            <w:rStyle w:val="Hyperlink"/>
+          </w:rPr>
+          <w:t xml:space="preserve">reference-run records</w:t>
+        </w:r>
+      </w:hyperlink>
+      <w:r>
+        <w:t xml:space="preserve"> </w:t>
+      </w:r>
+      <w:r>
+        <w:t xml:space="preserve">for the saved</w:t>
+      </w:r>
+      <w:r>
+        <w:t xml:space="preserve"> </w:t>
+      </w:r>
+      <w:r>
+        <w:t xml:space="preserve">configuration and metric definitions.</w:t>
       </w:r>
     </w:p>
     <w:p>
@@ -2094,25 +2115,13 @@
         <w:t xml:space="preserve"> </w:t>
       </w:r>
       <w:r>
-        <w:t xml:space="preserve">runs, not a guarantee of immediate or exact reproduction of the reference</w:t>
-      </w:r>
-      <w:r>
-        <w:t xml:space="preserve"> </w:t>
-      </w:r>
-      <w:r>
-        <w:t xml:space="preserve">checkpoint. Exact reproduction would additionally require the original</w:t>
-      </w:r>
-      <w:r>
-        <w:t xml:space="preserve"> </w:t>
-      </w:r>
-      <w:r>
-        <w:t xml:space="preserve">per-file membership, extraction recipes, split assignments, software environment,</w:t>
-      </w:r>
-      <w:r>
-        <w:t xml:space="preserve"> </w:t>
-      </w:r>
-      <w:r>
-        <w:t xml:space="preserve">and random training state. Source code and aggregate records</w:t>
+        <w:t xml:space="preserve">runs, not a guarantee of exact reproduction of the reference checkpoint.</w:t>
+      </w:r>
+      <w:r>
+        <w:t xml:space="preserve"> </w:t>
+      </w:r>
+      <w:r>
+        <w:t xml:space="preserve">Source code and aggregate records</w:t>
       </w:r>
       <w:r>
         <w:t xml:space="preserve"> </w:t>
@@ -2123,7 +2132,7 @@
       <w:r>
         <w:t xml:space="preserve"> </w:t>
       </w:r>
-      <w:hyperlink r:id="rId29">
+      <w:hyperlink r:id="rId31">
         <w:r>
           <w:rPr>
             <w:rStyle w:val="Hyperlink"/>
@@ -2292,8 +2301,8 @@
         <w:t xml:space="preserve">remain necessary before external data sharing.</w:t>
       </w:r>
     </w:p>
-    <w:bookmarkEnd w:id="30"/>
-    <w:bookmarkStart w:id="31" w:name="ai-usage-disclosure"/>
+    <w:bookmarkEnd w:id="32"/>
+    <w:bookmarkStart w:id="33" w:name="ai-usage-disclosure"/>
     <w:p>
       <w:pPr>
         <w:pStyle w:val="Heading1"/>
@@ -2328,8 +2337,8 @@
         <w:t xml:space="preserve">software and manuscript.</w:t>
       </w:r>
     </w:p>
-    <w:bookmarkEnd w:id="31"/>
-    <w:bookmarkStart w:id="32" w:name="acknowledgements"/>
+    <w:bookmarkEnd w:id="33"/>
+    <w:bookmarkStart w:id="34" w:name="acknowledgements"/>
     <w:p>
       <w:pPr>
         <w:pStyle w:val="Heading1"/>
@@ -2508,8 +2517,8 @@
         <w:t xml:space="preserve">Python scientific computing ecosystem.</w:t>
       </w:r>
     </w:p>
-    <w:bookmarkEnd w:id="32"/>
-    <w:bookmarkStart w:id="74" w:name="references"/>
+    <w:bookmarkEnd w:id="34"/>
+    <w:bookmarkStart w:id="76" w:name="references"/>
     <w:p>
       <w:pPr>
         <w:pStyle w:val="Heading1"/>
@@ -2518,8 +2527,8 @@
         <w:t xml:space="preserve">References</w:t>
       </w:r>
     </w:p>
-    <w:bookmarkStart w:id="73" w:name="refs"/>
-    <w:bookmarkStart w:id="34" w:name="ref-degerli2024hmcqu"/>
+    <w:bookmarkStart w:id="75" w:name="refs"/>
+    <w:bookmarkStart w:id="36" w:name="ref-degerli2024hmcqu"/>
     <w:p>
       <w:pPr>
         <w:pStyle w:val="Bibliography"/>
@@ -2552,7 +2561,7 @@
       <w:r>
         <w:t xml:space="preserve"> </w:t>
       </w:r>
-      <w:hyperlink r:id="rId33">
+      <w:hyperlink r:id="rId35">
         <w:r>
           <w:rPr>
             <w:rStyle w:val="Hyperlink"/>
@@ -2564,8 +2573,8 @@
         <w:t xml:space="preserve">.</w:t>
       </w:r>
     </w:p>
-    <w:bookmarkEnd w:id="34"/>
-    <w:bookmarkStart w:id="36" w:name="ref-ekambaram2026mimicext"/>
+    <w:bookmarkEnd w:id="36"/>
+    <w:bookmarkStart w:id="38" w:name="ref-ekambaram2026mimicext"/>
     <w:p>
       <w:pPr>
         <w:pStyle w:val="Bibliography"/>
@@ -2622,7 +2631,7 @@
       <w:r>
         <w:t xml:space="preserve"> </w:t>
       </w:r>
-      <w:hyperlink r:id="rId35">
+      <w:hyperlink r:id="rId37">
         <w:r>
           <w:rPr>
             <w:rStyle w:val="Hyperlink"/>
@@ -2634,8 +2643,8 @@
         <w:t xml:space="preserve">.</w:t>
       </w:r>
     </w:p>
-    <w:bookmarkEnd w:id="36"/>
-    <w:bookmarkStart w:id="38" w:name="ref-elmekki2025cactus"/>
+    <w:bookmarkEnd w:id="38"/>
+    <w:bookmarkStart w:id="40" w:name="ref-elmekki2025cactus"/>
     <w:p>
       <w:pPr>
         <w:pStyle w:val="Bibliography"/>
@@ -2674,7 +2683,7 @@
       <w:r>
         <w:t xml:space="preserve"> </w:t>
       </w:r>
-      <w:hyperlink r:id="rId37">
+      <w:hyperlink r:id="rId39">
         <w:r>
           <w:rPr>
             <w:rStyle w:val="Hyperlink"/>
@@ -2686,8 +2695,8 @@
         <w:t xml:space="preserve">.</w:t>
       </w:r>
     </w:p>
-    <w:bookmarkEnd w:id="38"/>
-    <w:bookmarkStart w:id="40" w:name="ref-goldberger2000physionet"/>
+    <w:bookmarkEnd w:id="40"/>
+    <w:bookmarkStart w:id="42" w:name="ref-goldberger2000physionet"/>
     <w:p>
       <w:pPr>
         <w:pStyle w:val="Bibliography"/>
@@ -2744,7 +2753,7 @@
       <w:r>
         <w:t xml:space="preserve"> </w:t>
       </w:r>
-      <w:hyperlink r:id="rId39">
+      <w:hyperlink r:id="rId41">
         <w:r>
           <w:rPr>
             <w:rStyle w:val="Hyperlink"/>
@@ -2756,8 +2765,8 @@
         <w:t xml:space="preserve">.</w:t>
       </w:r>
     </w:p>
-    <w:bookmarkEnd w:id="40"/>
-    <w:bookmarkStart w:id="42" w:name="ref-gow2023mimic"/>
+    <w:bookmarkEnd w:id="42"/>
+    <w:bookmarkStart w:id="44" w:name="ref-gow2023mimic"/>
     <w:p>
       <w:pPr>
         <w:pStyle w:val="Bibliography"/>
@@ -2788,7 +2797,7 @@
       <w:r>
         <w:t xml:space="preserve"> </w:t>
       </w:r>
-      <w:hyperlink r:id="rId41">
+      <w:hyperlink r:id="rId43">
         <w:r>
           <w:rPr>
             <w:rStyle w:val="Hyperlink"/>
@@ -2800,8 +2809,8 @@
         <w:t xml:space="preserve">.</w:t>
       </w:r>
     </w:p>
-    <w:bookmarkEnd w:id="42"/>
-    <w:bookmarkStart w:id="44" w:name="ref-gros2021ivadomed"/>
+    <w:bookmarkEnd w:id="44"/>
+    <w:bookmarkStart w:id="46" w:name="ref-gros2021ivadomed"/>
     <w:p>
       <w:pPr>
         <w:pStyle w:val="Bibliography"/>
@@ -2834,7 +2843,7 @@
       <w:r>
         <w:t xml:space="preserve"> </w:t>
       </w:r>
-      <w:hyperlink r:id="rId43">
+      <w:hyperlink r:id="rId45">
         <w:r>
           <w:rPr>
             <w:rStyle w:val="Hyperlink"/>
@@ -2846,8 +2855,8 @@
         <w:t xml:space="preserve">.</w:t>
       </w:r>
     </w:p>
-    <w:bookmarkEnd w:id="44"/>
-    <w:bookmarkStart w:id="46" w:name="ref-kline2023pylogik"/>
+    <w:bookmarkEnd w:id="46"/>
+    <w:bookmarkStart w:id="48" w:name="ref-kline2023pylogik"/>
     <w:p>
       <w:pPr>
         <w:pStyle w:val="Bibliography"/>
@@ -2885,7 +2894,7 @@
       <w:r>
         <w:t xml:space="preserve"> </w:t>
       </w:r>
-      <w:hyperlink r:id="rId45">
+      <w:hyperlink r:id="rId47">
         <w:r>
           <w:rPr>
             <w:rStyle w:val="Hyperlink"/>
@@ -2897,8 +2906,8 @@
         <w:t xml:space="preserve">.</w:t>
       </w:r>
     </w:p>
-    <w:bookmarkEnd w:id="46"/>
-    <w:bookmarkStart w:id="48" w:name="ref-madani2018fast-088"/>
+    <w:bookmarkEnd w:id="48"/>
+    <w:bookmarkStart w:id="50" w:name="ref-madani2018fast-088"/>
     <w:p>
       <w:pPr>
         <w:pStyle w:val="Bibliography"/>
@@ -2931,7 +2940,7 @@
       <w:r>
         <w:t xml:space="preserve"> </w:t>
       </w:r>
-      <w:hyperlink r:id="rId47">
+      <w:hyperlink r:id="rId49">
         <w:r>
           <w:rPr>
             <w:rStyle w:val="Hyperlink"/>
@@ -2943,8 +2952,8 @@
         <w:t xml:space="preserve">.</w:t>
       </w:r>
     </w:p>
-    <w:bookmarkEnd w:id="48"/>
-    <w:bookmarkStart w:id="50" w:name="ref-milletari2016vnet"/>
+    <w:bookmarkEnd w:id="50"/>
+    <w:bookmarkStart w:id="52" w:name="ref-milletari2016vnet"/>
     <w:p>
       <w:pPr>
         <w:pStyle w:val="Bibliography"/>
@@ -3022,7 +3031,7 @@
       <w:r>
         <w:t xml:space="preserve"> </w:t>
       </w:r>
-      <w:hyperlink r:id="rId49">
+      <w:hyperlink r:id="rId51">
         <w:r>
           <w:rPr>
             <w:rStyle w:val="Hyperlink"/>
@@ -3034,8 +3043,8 @@
         <w:t xml:space="preserve">.</w:t>
       </w:r>
     </w:p>
-    <w:bookmarkEnd w:id="50"/>
-    <w:bookmarkStart w:id="52" w:name="ref-monteiro2017deid"/>
+    <w:bookmarkEnd w:id="52"/>
+    <w:bookmarkStart w:id="54" w:name="ref-monteiro2017deid"/>
     <w:p>
       <w:pPr>
         <w:pStyle w:val="Bibliography"/>
@@ -3080,7 +3089,7 @@
       <w:r>
         <w:t xml:space="preserve"> </w:t>
       </w:r>
-      <w:hyperlink r:id="rId51">
+      <w:hyperlink r:id="rId53">
         <w:r>
           <w:rPr>
             <w:rStyle w:val="Hyperlink"/>
@@ -3092,8 +3101,8 @@
         <w:t xml:space="preserve">.</w:t>
       </w:r>
     </w:p>
-    <w:bookmarkEnd w:id="52"/>
-    <w:bookmarkStart w:id="54" w:name="ref-ouyang2020echonet"/>
+    <w:bookmarkEnd w:id="54"/>
+    <w:bookmarkStart w:id="56" w:name="ref-ouyang2020echonet"/>
     <w:p>
       <w:pPr>
         <w:pStyle w:val="Bibliography"/>
@@ -3138,7 +3147,7 @@
       <w:r>
         <w:t xml:space="preserve"> </w:t>
       </w:r>
-      <w:hyperlink r:id="rId53">
+      <w:hyperlink r:id="rId55">
         <w:r>
           <w:rPr>
             <w:rStyle w:val="Hyperlink"/>
@@ -3150,8 +3159,8 @@
         <w:t xml:space="preserve">.</w:t>
       </w:r>
     </w:p>
-    <w:bookmarkEnd w:id="54"/>
-    <w:bookmarkStart w:id="56" w:name="ref-panhuis2014systematic-d31"/>
+    <w:bookmarkEnd w:id="56"/>
+    <w:bookmarkStart w:id="58" w:name="ref-panhuis2014systematic-d31"/>
     <w:p>
       <w:pPr>
         <w:pStyle w:val="Bibliography"/>
@@ -3184,7 +3193,7 @@
       <w:r>
         <w:t xml:space="preserve"> </w:t>
       </w:r>
-      <w:hyperlink r:id="rId55">
+      <w:hyperlink r:id="rId57">
         <w:r>
           <w:rPr>
             <w:rStyle w:val="Hyperlink"/>
@@ -3196,8 +3205,8 @@
         <w:t xml:space="preserve">.</w:t>
       </w:r>
     </w:p>
-    <w:bookmarkEnd w:id="56"/>
-    <w:bookmarkStart w:id="58" w:name="ref-reddy2022echonetpeds"/>
+    <w:bookmarkEnd w:id="58"/>
+    <w:bookmarkStart w:id="60" w:name="ref-reddy2022echonetpeds"/>
     <w:p>
       <w:pPr>
         <w:pStyle w:val="Bibliography"/>
@@ -3230,7 +3239,7 @@
       <w:r>
         <w:t xml:space="preserve"> </w:t>
       </w:r>
-      <w:hyperlink r:id="rId57">
+      <w:hyperlink r:id="rId59">
         <w:r>
           <w:rPr>
             <w:rStyle w:val="Hyperlink"/>
@@ -3242,8 +3251,8 @@
         <w:t xml:space="preserve">.</w:t>
       </w:r>
     </w:p>
-    <w:bookmarkEnd w:id="58"/>
-    <w:bookmarkStart w:id="60" w:name="ref-ronneberger2015unet"/>
+    <w:bookmarkEnd w:id="60"/>
+    <w:bookmarkStart w:id="62" w:name="ref-ronneberger2015unet"/>
     <w:p>
       <w:pPr>
         <w:pStyle w:val="Bibliography"/>
@@ -3293,7 +3302,7 @@
       <w:r>
         <w:t xml:space="preserve"> </w:t>
       </w:r>
-      <w:hyperlink r:id="rId59">
+      <w:hyperlink r:id="rId61">
         <w:r>
           <w:rPr>
             <w:rStyle w:val="Hyperlink"/>
@@ -3305,8 +3314,8 @@
         <w:t xml:space="preserve">.</w:t>
       </w:r>
     </w:p>
-    <w:bookmarkEnd w:id="60"/>
-    <w:bookmarkStart w:id="62" w:name="ref-rudin1992tv"/>
+    <w:bookmarkEnd w:id="62"/>
+    <w:bookmarkStart w:id="64" w:name="ref-rudin1992tv"/>
     <w:p>
       <w:pPr>
         <w:pStyle w:val="Bibliography"/>
@@ -3339,7 +3348,7 @@
       <w:r>
         <w:t xml:space="preserve"> </w:t>
       </w:r>
-      <w:hyperlink r:id="rId61">
+      <w:hyperlink r:id="rId63">
         <w:r>
           <w:rPr>
             <w:rStyle w:val="Hyperlink"/>
@@ -3351,8 +3360,8 @@
         <w:t xml:space="preserve">.</w:t>
       </w:r>
     </w:p>
-    <w:bookmarkEnd w:id="62"/>
-    <w:bookmarkStart w:id="64" w:name="ref-russell2008labelme-d8b"/>
+    <w:bookmarkEnd w:id="64"/>
+    <w:bookmarkStart w:id="66" w:name="ref-russell2008labelme-d8b"/>
     <w:p>
       <w:pPr>
         <w:pStyle w:val="Bibliography"/>
@@ -3385,7 +3394,7 @@
       <w:r>
         <w:t xml:space="preserve"> </w:t>
       </w:r>
-      <w:hyperlink r:id="rId63">
+      <w:hyperlink r:id="rId65">
         <w:r>
           <w:rPr>
             <w:rStyle w:val="Hyperlink"/>
@@ -3397,8 +3406,8 @@
         <w:t xml:space="preserve">.</w:t>
       </w:r>
     </w:p>
-    <w:bookmarkEnd w:id="64"/>
-    <w:bookmarkStart w:id="66" w:name="ref-shannon1948"/>
+    <w:bookmarkEnd w:id="66"/>
+    <w:bookmarkStart w:id="68" w:name="ref-shannon1948"/>
     <w:p>
       <w:pPr>
         <w:pStyle w:val="Bibliography"/>
@@ -3431,7 +3440,7 @@
       <w:r>
         <w:t xml:space="preserve"> </w:t>
       </w:r>
-      <w:hyperlink r:id="rId65">
+      <w:hyperlink r:id="rId67">
         <w:r>
           <w:rPr>
             <w:rStyle w:val="Hyperlink"/>
@@ -3443,8 +3452,8 @@
         <w:t xml:space="preserve">.</w:t>
       </w:r>
     </w:p>
-    <w:bookmarkEnd w:id="66"/>
-    <w:bookmarkStart w:id="68" w:name="ref-srivastava2014dropout"/>
+    <w:bookmarkEnd w:id="68"/>
+    <w:bookmarkStart w:id="70" w:name="ref-srivastava2014dropout"/>
     <w:p>
       <w:pPr>
         <w:pStyle w:val="Bibliography"/>
@@ -3477,7 +3486,7 @@
       <w:r>
         <w:t xml:space="preserve"> </w:t>
       </w:r>
-      <w:hyperlink r:id="rId67">
+      <w:hyperlink r:id="rId69">
         <w:r>
           <w:rPr>
             <w:rStyle w:val="Hyperlink"/>
@@ -3489,8 +3498,8 @@
         <w:t xml:space="preserve">.</w:t>
       </w:r>
     </w:p>
-    <w:bookmarkEnd w:id="68"/>
-    <w:bookmarkStart w:id="70" w:name="ref-wang2021echocp"/>
+    <w:bookmarkEnd w:id="70"/>
+    <w:bookmarkStart w:id="72" w:name="ref-wang2021echocp"/>
     <w:p>
       <w:pPr>
         <w:pStyle w:val="Bibliography"/>
@@ -3550,7 +3559,7 @@
       <w:r>
         <w:t xml:space="preserve"> </w:t>
       </w:r>
-      <w:hyperlink r:id="rId69">
+      <w:hyperlink r:id="rId71">
         <w:r>
           <w:rPr>
             <w:rStyle w:val="Hyperlink"/>
@@ -3562,8 +3571,8 @@
         <w:t xml:space="preserve">.</w:t>
       </w:r>
     </w:p>
-    <w:bookmarkEnd w:id="70"/>
-    <w:bookmarkStart w:id="72" w:name="ref-yang2023graphecho"/>
+    <w:bookmarkEnd w:id="72"/>
+    <w:bookmarkStart w:id="74" w:name="ref-yang2023graphecho"/>
     <w:p>
       <w:pPr>
         <w:pStyle w:val="Bibliography"/>
@@ -3594,7 +3603,7 @@
       <w:r>
         <w:t xml:space="preserve"> </w:t>
       </w:r>
-      <w:hyperlink r:id="rId71">
+      <w:hyperlink r:id="rId73">
         <w:r>
           <w:rPr>
             <w:rStyle w:val="Hyperlink"/>
@@ -3606,9 +3615,9 @@
         <w:t xml:space="preserve">.</w:t>
       </w:r>
     </w:p>
-    <w:bookmarkEnd w:id="72"/>
-    <w:bookmarkEnd w:id="73"/>
     <w:bookmarkEnd w:id="74"/>
+    <w:bookmarkEnd w:id="75"/>
+    <w:bookmarkEnd w:id="76"/>
     <w:sectPr>
       <w:footnotePr>
         <w:numRestart w:val="eachSect"/>

</xml_diff>